<commit_message>
Draft1 reviewed by CS
</commit_message>
<xml_diff>
--- a/ZenabuPhD/COMMUNITY PROTECTION/TODOS.docx
+++ b/ZenabuPhD/COMMUNITY PROTECTION/TODOS.docx
@@ -189,6 +189,80 @@
     </w:p>
     <w:p>
       <w:pPr>
+        <w:jc w:val="center"/>
+        <w:rPr>
+          <w:b/>
+          <w:bCs/>
+          <w:color w:val="FF0000"/>
+          <w:sz w:val="22"/>
+          <w:szCs w:val="22"/>
+        </w:rPr>
+      </w:pPr>
+      <w:r>
+        <w:rPr>
+          <w:b/>
+          <w:bCs/>
+          <w:color w:val="FF0000"/>
+          <w:sz w:val="22"/>
+          <w:szCs w:val="22"/>
+        </w:rPr>
+        <w:t>0-5</w:t>
+      </w:r>
+    </w:p>
+    <w:p>
+      <w:pPr>
+        <w:rPr>
+          <w:color w:val="FF0000"/>
+          <w:sz w:val="22"/>
+          <w:szCs w:val="22"/>
+        </w:rPr>
+      </w:pPr>
+      <w:r>
+        <w:rPr>
+          <w:noProof/>
+          <w:color w:val="FF0000"/>
+          <w:sz w:val="22"/>
+          <w:szCs w:val="22"/>
+        </w:rPr>
+        <w:drawing>
+          <wp:inline distT="0" distB="0" distL="0" distR="0" wp14:anchorId="53264496" wp14:editId="3EA93D27">
+            <wp:extent cx="5731510" cy="2717165"/>
+            <wp:effectExtent l="0" t="0" r="2540" b="6985"/>
+            <wp:docPr id="2145962045" name="Picture 1"/>
+            <wp:cNvGraphicFramePr>
+              <a:graphicFrameLocks xmlns:a="http://schemas.openxmlformats.org/drawingml/2006/main" noChangeAspect="1"/>
+            </wp:cNvGraphicFramePr>
+            <a:graphic xmlns:a="http://schemas.openxmlformats.org/drawingml/2006/main">
+              <a:graphicData uri="http://schemas.openxmlformats.org/drawingml/2006/picture">
+                <pic:pic xmlns:pic="http://schemas.openxmlformats.org/drawingml/2006/picture">
+                  <pic:nvPicPr>
+                    <pic:cNvPr id="2145962045" name=""/>
+                    <pic:cNvPicPr/>
+                  </pic:nvPicPr>
+                  <pic:blipFill>
+                    <a:blip r:embed="rId8"/>
+                    <a:stretch>
+                      <a:fillRect/>
+                    </a:stretch>
+                  </pic:blipFill>
+                  <pic:spPr>
+                    <a:xfrm>
+                      <a:off x="0" y="0"/>
+                      <a:ext cx="5731510" cy="2717165"/>
+                    </a:xfrm>
+                    <a:prstGeom prst="rect">
+                      <a:avLst/>
+                    </a:prstGeom>
+                  </pic:spPr>
+                </pic:pic>
+              </a:graphicData>
+            </a:graphic>
+          </wp:inline>
+        </w:drawing>
+      </w:r>
+    </w:p>
+    <w:p>
+      <w:pPr>
         <w:numPr>
           <w:ilvl w:val="0"/>
           <w:numId w:val="1"/>
@@ -246,6 +320,7 @@
           <w:sz w:val="22"/>
           <w:szCs w:val="22"/>
         </w:rPr>
+        <w:lastRenderedPageBreak/>
         <w:drawing>
           <wp:inline distT="0" distB="0" distL="0" distR="0" wp14:anchorId="0B4054C5" wp14:editId="68A1EBBA">
             <wp:extent cx="5731510" cy="2701925"/>
@@ -262,7 +337,7 @@
                     <pic:cNvPicPr/>
                   </pic:nvPicPr>
                   <pic:blipFill>
-                    <a:blip r:embed="rId8"/>
+                    <a:blip r:embed="rId9"/>
                     <a:stretch>
                       <a:fillRect/>
                     </a:stretch>
@@ -292,6 +367,147 @@
           <w:u w:val="single"/>
         </w:rPr>
       </w:pPr>
+      <w:r>
+        <w:rPr>
+          <w:color w:val="FF0000"/>
+          <w:sz w:val="22"/>
+          <w:szCs w:val="22"/>
+          <w:u w:val="single"/>
+        </w:rPr>
+        <w:t>U5</w:t>
+      </w:r>
+    </w:p>
+    <w:p>
+      <w:pPr>
+        <w:rPr>
+          <w:color w:val="FF0000"/>
+          <w:sz w:val="22"/>
+          <w:szCs w:val="22"/>
+          <w:u w:val="single"/>
+        </w:rPr>
+      </w:pPr>
+      <w:r>
+        <w:rPr>
+          <w:noProof/>
+          <w:color w:val="FF0000"/>
+          <w:sz w:val="22"/>
+          <w:szCs w:val="22"/>
+          <w:u w:val="single"/>
+        </w:rPr>
+        <w:drawing>
+          <wp:inline distT="0" distB="0" distL="0" distR="0" wp14:anchorId="6DF3BC61" wp14:editId="3ACD30FE">
+            <wp:extent cx="5731510" cy="2734310"/>
+            <wp:effectExtent l="0" t="0" r="2540" b="8890"/>
+            <wp:docPr id="978987325" name="Picture 1"/>
+            <wp:cNvGraphicFramePr>
+              <a:graphicFrameLocks xmlns:a="http://schemas.openxmlformats.org/drawingml/2006/main" noChangeAspect="1"/>
+            </wp:cNvGraphicFramePr>
+            <a:graphic xmlns:a="http://schemas.openxmlformats.org/drawingml/2006/main">
+              <a:graphicData uri="http://schemas.openxmlformats.org/drawingml/2006/picture">
+                <pic:pic xmlns:pic="http://schemas.openxmlformats.org/drawingml/2006/picture">
+                  <pic:nvPicPr>
+                    <pic:cNvPr id="978987325" name=""/>
+                    <pic:cNvPicPr/>
+                  </pic:nvPicPr>
+                  <pic:blipFill>
+                    <a:blip r:embed="rId10"/>
+                    <a:stretch>
+                      <a:fillRect/>
+                    </a:stretch>
+                  </pic:blipFill>
+                  <pic:spPr>
+                    <a:xfrm>
+                      <a:off x="0" y="0"/>
+                      <a:ext cx="5731510" cy="2734310"/>
+                    </a:xfrm>
+                    <a:prstGeom prst="rect">
+                      <a:avLst/>
+                    </a:prstGeom>
+                  </pic:spPr>
+                </pic:pic>
+              </a:graphicData>
+            </a:graphic>
+          </wp:inline>
+        </w:drawing>
+      </w:r>
+    </w:p>
+    <w:p>
+      <w:pPr>
+        <w:rPr>
+          <w:color w:val="FF0000"/>
+          <w:sz w:val="22"/>
+          <w:szCs w:val="22"/>
+          <w:u w:val="single"/>
+        </w:rPr>
+      </w:pPr>
+    </w:p>
+    <w:p>
+      <w:pPr>
+        <w:rPr>
+          <w:color w:val="FF0000"/>
+          <w:sz w:val="22"/>
+          <w:szCs w:val="22"/>
+          <w:u w:val="single"/>
+        </w:rPr>
+      </w:pPr>
+      <w:r>
+        <w:rPr>
+          <w:rFonts w:ascii="Arial" w:hAnsi="Arial" w:cs="Arial"/>
+          <w:noProof/>
+        </w:rPr>
+        <w:lastRenderedPageBreak/>
+        <w:drawing>
+          <wp:inline distT="0" distB="0" distL="0" distR="0" wp14:anchorId="6083FDE5" wp14:editId="42B0183A">
+            <wp:extent cx="4844005" cy="3530168"/>
+            <wp:effectExtent l="0" t="0" r="0" b="0"/>
+            <wp:docPr id="1421601603" name="Picture 3"/>
+            <wp:cNvGraphicFramePr>
+              <a:graphicFrameLocks xmlns:a="http://schemas.openxmlformats.org/drawingml/2006/main" noChangeAspect="1"/>
+            </wp:cNvGraphicFramePr>
+            <a:graphic xmlns:a="http://schemas.openxmlformats.org/drawingml/2006/main">
+              <a:graphicData uri="http://schemas.openxmlformats.org/drawingml/2006/picture">
+                <pic:pic xmlns:pic="http://schemas.openxmlformats.org/drawingml/2006/picture">
+                  <pic:nvPicPr>
+                    <pic:cNvPr id="1421601603" name="Picture 1421601603"/>
+                    <pic:cNvPicPr/>
+                  </pic:nvPicPr>
+                  <pic:blipFill>
+                    <a:blip r:embed="rId11">
+                      <a:extLst>
+                        <a:ext uri="{28A0092B-C50C-407E-A947-70E740481C1C}">
+                          <a14:useLocalDpi xmlns:a14="http://schemas.microsoft.com/office/drawing/2010/main" val="0"/>
+                        </a:ext>
+                      </a:extLst>
+                    </a:blip>
+                    <a:stretch>
+                      <a:fillRect/>
+                    </a:stretch>
+                  </pic:blipFill>
+                  <pic:spPr>
+                    <a:xfrm>
+                      <a:off x="0" y="0"/>
+                      <a:ext cx="4853034" cy="3536748"/>
+                    </a:xfrm>
+                    <a:prstGeom prst="rect">
+                      <a:avLst/>
+                    </a:prstGeom>
+                  </pic:spPr>
+                </pic:pic>
+              </a:graphicData>
+            </a:graphic>
+          </wp:inline>
+        </w:drawing>
+      </w:r>
+    </w:p>
+    <w:p>
+      <w:pPr>
+        <w:rPr>
+          <w:color w:val="FF0000"/>
+          <w:sz w:val="22"/>
+          <w:szCs w:val="22"/>
+          <w:u w:val="single"/>
+        </w:rPr>
+      </w:pPr>
     </w:p>
     <w:p>
       <w:pPr>
@@ -313,7 +529,6 @@
           <w:sz w:val="22"/>
           <w:szCs w:val="22"/>
         </w:rPr>
-        <w:lastRenderedPageBreak/>
         <w:t>How does this community effect vary with transmission intensity/EIR? =&gt; what is the coverage needed to achieve an impact of 10 or 20% reduction in prevalence</w:t>
       </w:r>
       <w:r>
@@ -323,36 +538,16 @@
           <w:sz w:val="22"/>
           <w:szCs w:val="22"/>
         </w:rPr>
-        <w:t xml:space="preserve"> among non-</w:t>
-      </w:r>
-      <w:proofErr w:type="gramStart"/>
-      <w:r>
-        <w:rPr>
-          <w:b/>
-          <w:bCs/>
-          <w:sz w:val="22"/>
-          <w:szCs w:val="22"/>
-        </w:rPr>
-        <w:t>users?</w:t>
-      </w:r>
-      <w:r>
-        <w:rPr>
-          <w:b/>
-          <w:bCs/>
-          <w:sz w:val="22"/>
-          <w:szCs w:val="22"/>
-        </w:rPr>
-        <w:t>,</w:t>
-      </w:r>
-      <w:proofErr w:type="gramEnd"/>
-      <w:r>
-        <w:rPr>
-          <w:b/>
-          <w:bCs/>
-          <w:sz w:val="22"/>
-          <w:szCs w:val="22"/>
-        </w:rPr>
-        <w:t xml:space="preserve"> varying with EIR?</w:t>
+        <w:t xml:space="preserve"> among non-users?</w:t>
+      </w:r>
+      <w:r>
+        <w:rPr>
+          <w:b/>
+          <w:bCs/>
+          <w:sz w:val="22"/>
+          <w:szCs w:val="22"/>
+        </w:rPr>
+        <w:t>, varying with EIR?</w:t>
       </w:r>
     </w:p>
     <w:p>
@@ -405,7 +600,7 @@
                     <pic:cNvPicPr/>
                   </pic:nvPicPr>
                   <pic:blipFill>
-                    <a:blip r:embed="rId9"/>
+                    <a:blip r:embed="rId12"/>
                     <a:stretch>
                       <a:fillRect/>
                     </a:stretch>
@@ -439,25 +634,25 @@
           <w:sz w:val="22"/>
           <w:szCs w:val="22"/>
         </w:rPr>
-        <w:t xml:space="preserve"> (</w:t>
-      </w:r>
-      <w:proofErr w:type="spellStart"/>
+        <w:t xml:space="preserve"> (eg, 100)</w:t>
+      </w:r>
       <w:r>
         <w:rPr>
           <w:color w:val="FF0000"/>
           <w:sz w:val="22"/>
           <w:szCs w:val="22"/>
         </w:rPr>
-        <w:t>eg</w:t>
-      </w:r>
-      <w:proofErr w:type="spellEnd"/>
-      <w:r>
-        <w:rPr>
+        <w:t xml:space="preserve">, </w:t>
+      </w:r>
+      <w:r>
+        <w:rPr>
+          <w:b/>
+          <w:bCs/>
           <w:color w:val="FF0000"/>
           <w:sz w:val="22"/>
           <w:szCs w:val="22"/>
         </w:rPr>
-        <w:t>, 100)</w:t>
+        <w:t>20% reduction among non-users may be unattainable</w:t>
       </w:r>
       <w:r>
         <w:rPr>
@@ -465,47 +660,28 @@
           <w:sz w:val="22"/>
           <w:szCs w:val="22"/>
         </w:rPr>
-        <w:t xml:space="preserve">, </w:t>
-      </w:r>
-      <w:r>
-        <w:rPr>
-          <w:b/>
-          <w:bCs/>
+        <w:t>, even at high coverage</w:t>
+      </w:r>
+    </w:p>
+    <w:p>
+      <w:pPr>
+        <w:rPr>
           <w:color w:val="FF0000"/>
           <w:sz w:val="22"/>
           <w:szCs w:val="22"/>
         </w:rPr>
-        <w:t>20% reduction among non-users may be unattainable</w:t>
-      </w:r>
-      <w:r>
-        <w:rPr>
-          <w:color w:val="FF0000"/>
-          <w:sz w:val="22"/>
-          <w:szCs w:val="22"/>
-        </w:rPr>
-        <w:t>, even at high coverage</w:t>
-      </w:r>
-    </w:p>
-    <w:p>
-      <w:pPr>
-        <w:rPr>
-          <w:color w:val="FF0000"/>
-          <w:sz w:val="22"/>
-          <w:szCs w:val="22"/>
-        </w:rPr>
-      </w:pPr>
-      <w:r>
-        <w:rPr>
+      </w:pPr>
+      <w:r>
+        <w:rPr>
+          <w:rFonts w:ascii="Arial" w:hAnsi="Arial" w:cs="Arial"/>
           <w:noProof/>
-          <w:color w:val="FF0000"/>
-          <w:sz w:val="22"/>
-          <w:szCs w:val="22"/>
-        </w:rPr>
+        </w:rPr>
+        <w:lastRenderedPageBreak/>
         <w:drawing>
-          <wp:inline distT="0" distB="0" distL="0" distR="0" wp14:anchorId="3D6D6EBD" wp14:editId="24782003">
-            <wp:extent cx="5731510" cy="2705100"/>
-            <wp:effectExtent l="0" t="0" r="2540" b="0"/>
-            <wp:docPr id="1305923434" name="Picture 1"/>
+          <wp:inline distT="0" distB="0" distL="0" distR="0" wp14:anchorId="7BA3C63B" wp14:editId="54F8D153">
+            <wp:extent cx="4323144" cy="3355811"/>
+            <wp:effectExtent l="0" t="0" r="1270" b="0"/>
+            <wp:docPr id="607165799" name="Picture 4"/>
             <wp:cNvGraphicFramePr>
               <a:graphicFrameLocks xmlns:a="http://schemas.openxmlformats.org/drawingml/2006/main" noChangeAspect="1"/>
             </wp:cNvGraphicFramePr>
@@ -513,11 +689,17 @@
               <a:graphicData uri="http://schemas.openxmlformats.org/drawingml/2006/picture">
                 <pic:pic xmlns:pic="http://schemas.openxmlformats.org/drawingml/2006/picture">
                   <pic:nvPicPr>
-                    <pic:cNvPr id="1305923434" name=""/>
+                    <pic:cNvPr id="607165799" name="Picture 607165799"/>
                     <pic:cNvPicPr/>
                   </pic:nvPicPr>
                   <pic:blipFill>
-                    <a:blip r:embed="rId10"/>
+                    <a:blip r:embed="rId13">
+                      <a:extLst>
+                        <a:ext uri="{28A0092B-C50C-407E-A947-70E740481C1C}">
+                          <a14:useLocalDpi xmlns:a14="http://schemas.microsoft.com/office/drawing/2010/main" val="0"/>
+                        </a:ext>
+                      </a:extLst>
+                    </a:blip>
                     <a:stretch>
                       <a:fillRect/>
                     </a:stretch>
@@ -525,7 +707,7 @@
                   <pic:spPr>
                     <a:xfrm>
                       <a:off x="0" y="0"/>
-                      <a:ext cx="5731510" cy="2705100"/>
+                      <a:ext cx="4338077" cy="3367403"/>
                     </a:xfrm>
                     <a:prstGeom prst="rect">
                       <a:avLst/>
@@ -584,7 +766,23 @@
           <w:sz w:val="22"/>
           <w:szCs w:val="22"/>
         </w:rPr>
-        <w:t xml:space="preserve">18 - </w:t>
+        <w:t>1</w:t>
+      </w:r>
+      <w:r>
+        <w:rPr>
+          <w:color w:val="FF0000"/>
+          <w:sz w:val="22"/>
+          <w:szCs w:val="22"/>
+        </w:rPr>
+        <w:t>7</w:t>
+      </w:r>
+      <w:r>
+        <w:rPr>
+          <w:color w:val="FF0000"/>
+          <w:sz w:val="22"/>
+          <w:szCs w:val="22"/>
+        </w:rPr>
+        <w:t xml:space="preserve"> - </w:t>
       </w:r>
       <w:r>
         <w:rPr>
@@ -639,7 +837,6 @@
           <w:sz w:val="22"/>
           <w:szCs w:val="22"/>
         </w:rPr>
-        <w:lastRenderedPageBreak/>
         <w:t>At which coverage do we maximize the difference or ratio between prevalence reduction in overall vs prevalence reduction in users only?</w:t>
       </w:r>
     </w:p>
@@ -662,7 +859,6 @@
           <w:szCs w:val="22"/>
         </w:rPr>
       </w:pPr>
-      <w:proofErr w:type="spellStart"/>
       <w:r>
         <w:rPr>
           <w:b/>
@@ -672,7 +868,6 @@
         </w:rPr>
         <w:t>nInfect</w:t>
       </w:r>
-      <w:proofErr w:type="spellEnd"/>
       <w:r>
         <w:rPr>
           <w:sz w:val="22"/>
@@ -747,6 +942,7 @@
           <w:sz w:val="22"/>
           <w:szCs w:val="22"/>
         </w:rPr>
+        <w:lastRenderedPageBreak/>
         <w:drawing>
           <wp:inline distT="0" distB="0" distL="0" distR="0" wp14:anchorId="4ABB692A" wp14:editId="35FA4724">
             <wp:extent cx="5731510" cy="2735580"/>
@@ -763,7 +959,7 @@
                     <pic:cNvPicPr/>
                   </pic:nvPicPr>
                   <pic:blipFill>
-                    <a:blip r:embed="rId11"/>
+                    <a:blip r:embed="rId14"/>
                     <a:stretch>
                       <a:fillRect/>
                     </a:stretch>
@@ -797,7 +993,6 @@
           <w:szCs w:val="22"/>
         </w:rPr>
       </w:pPr>
-      <w:proofErr w:type="spellStart"/>
       <w:r>
         <w:rPr>
           <w:b/>
@@ -807,7 +1002,6 @@
         </w:rPr>
         <w:t>innoculationsPerAgeGroup</w:t>
       </w:r>
-      <w:proofErr w:type="spellEnd"/>
       <w:r>
         <w:rPr>
           <w:b/>
@@ -906,7 +1100,7 @@
                     <pic:cNvPicPr/>
                   </pic:nvPicPr>
                   <pic:blipFill>
-                    <a:blip r:embed="rId12"/>
+                    <a:blip r:embed="rId15"/>
                     <a:stretch>
                       <a:fillRect/>
                     </a:stretch>
@@ -1015,7 +1209,6 @@
           <w:szCs w:val="22"/>
           <w:u w:val="single"/>
         </w:rPr>
-        <w:lastRenderedPageBreak/>
         <w:t>other to do</w:t>
       </w:r>
       <w:r>
@@ -1107,17 +1300,8 @@
           <w:sz w:val="22"/>
           <w:szCs w:val="22"/>
         </w:rPr>
-        <w:t xml:space="preserve">look at other </w:t>
-      </w:r>
-      <w:proofErr w:type="spellStart"/>
-      <w:r>
-        <w:rPr>
-          <w:sz w:val="22"/>
-          <w:szCs w:val="22"/>
-        </w:rPr>
-        <w:t>intreventions</w:t>
-      </w:r>
-      <w:proofErr w:type="spellEnd"/>
+        <w:t>look at other intreventions</w:t>
+      </w:r>
     </w:p>
     <w:p>
       <w:pPr>
@@ -1285,23 +1469,7 @@
           <w:szCs w:val="22"/>
         </w:rPr>
         <w:br/>
-        <w:t xml:space="preserve">A) simulation without </w:t>
-      </w:r>
-      <w:proofErr w:type="spellStart"/>
-      <w:r>
-        <w:rPr>
-          <w:sz w:val="22"/>
-          <w:szCs w:val="22"/>
-        </w:rPr>
-        <w:t>bednets</w:t>
-      </w:r>
-      <w:proofErr w:type="spellEnd"/>
-      <w:r>
-        <w:rPr>
-          <w:sz w:val="22"/>
-          <w:szCs w:val="22"/>
-        </w:rPr>
-        <w:t xml:space="preserve"> </w:t>
+        <w:t xml:space="preserve">A) simulation without bednets </w:t>
       </w:r>
       <w:r>
         <w:rPr>
@@ -1318,23 +1486,7 @@
           <w:szCs w:val="22"/>
         </w:rPr>
         <w:br/>
-        <w:t xml:space="preserve">B) simulation with </w:t>
-      </w:r>
-      <w:proofErr w:type="spellStart"/>
-      <w:r>
-        <w:rPr>
-          <w:sz w:val="22"/>
-          <w:szCs w:val="22"/>
-        </w:rPr>
-        <w:t>bednets</w:t>
-      </w:r>
-      <w:proofErr w:type="spellEnd"/>
-      <w:r>
-        <w:rPr>
-          <w:sz w:val="22"/>
-          <w:szCs w:val="22"/>
-        </w:rPr>
-        <w:t>, but having the ratio for users R_B1 and non-users R_B2...</w:t>
+        <w:t>B) simulation with bednets, but having the ratio for users R_B1 and non-users R_B2...</w:t>
       </w:r>
       <w:r>
         <w:rPr>
@@ -1342,23 +1494,7 @@
           <w:szCs w:val="22"/>
         </w:rPr>
         <w:br/>
-        <w:t xml:space="preserve">Comparing R_A vs R_B2, if they are the same, the benefit of decreasing EIR through </w:t>
-      </w:r>
-      <w:proofErr w:type="spellStart"/>
-      <w:r>
-        <w:rPr>
-          <w:sz w:val="22"/>
-          <w:szCs w:val="22"/>
-        </w:rPr>
-        <w:t>bednets</w:t>
-      </w:r>
-      <w:proofErr w:type="spellEnd"/>
-      <w:r>
-        <w:rPr>
-          <w:sz w:val="22"/>
-          <w:szCs w:val="22"/>
-        </w:rPr>
-        <w:t xml:space="preserve"> and having more immunity experienced in non-users should even out, if not, then we would like to understand whether R_B2 is benefiting more from decreases EIR or increased immunity (compared to non-users)..</w:t>
+        <w:t>Comparing R_A vs R_B2, if they are the same, the benefit of decreasing EIR through bednets and having more immunity experienced in non-users should even out, if not, then we would like to understand whether R_B2 is benefiting more from decreases EIR or increased immunity (compared to non-users)..</w:t>
       </w:r>
     </w:p>
     <w:p>
@@ -1407,52 +1543,24 @@
           <w:sz w:val="22"/>
           <w:szCs w:val="22"/>
         </w:rPr>
-        <w:t xml:space="preserve">simulation without </w:t>
-      </w:r>
-      <w:proofErr w:type="spellStart"/>
+        <w:t xml:space="preserve">simulation without bednets R_A – using </w:t>
+      </w:r>
       <w:r>
         <w:rPr>
           <w:color w:val="ADADAD" w:themeColor="background2" w:themeShade="BF"/>
           <w:sz w:val="22"/>
           <w:szCs w:val="22"/>
         </w:rPr>
-        <w:t>bednets</w:t>
-      </w:r>
-      <w:proofErr w:type="spellEnd"/>
+        <w:t>CM only</w:t>
+      </w:r>
       <w:r>
         <w:rPr>
           <w:color w:val="ADADAD" w:themeColor="background2" w:themeShade="BF"/>
           <w:sz w:val="22"/>
           <w:szCs w:val="22"/>
         </w:rPr>
-        <w:t xml:space="preserve"> R_A – using </w:t>
-      </w:r>
-      <w:r>
-        <w:rPr>
-          <w:color w:val="ADADAD" w:themeColor="background2" w:themeShade="BF"/>
-          <w:sz w:val="22"/>
-          <w:szCs w:val="22"/>
-        </w:rPr>
-        <w:t xml:space="preserve">CM </w:t>
-      </w:r>
-      <w:proofErr w:type="spellStart"/>
-      <w:r>
-        <w:rPr>
-          <w:color w:val="ADADAD" w:themeColor="background2" w:themeShade="BF"/>
-          <w:sz w:val="22"/>
-          <w:szCs w:val="22"/>
-        </w:rPr>
-        <w:t>only</w:t>
-      </w:r>
-      <w:r>
-        <w:rPr>
-          <w:color w:val="ADADAD" w:themeColor="background2" w:themeShade="BF"/>
-          <w:sz w:val="22"/>
-          <w:szCs w:val="22"/>
-        </w:rPr>
         <w:t>_nInfect</w:t>
       </w:r>
-      <w:proofErr w:type="spellEnd"/>
       <w:r>
         <w:rPr>
           <w:color w:val="ADADAD" w:themeColor="background2" w:themeShade="BF"/>
@@ -1491,25 +1599,7 @@
           <w:sz w:val="22"/>
           <w:szCs w:val="22"/>
         </w:rPr>
-        <w:t xml:space="preserve">simulation with </w:t>
-      </w:r>
-      <w:proofErr w:type="spellStart"/>
-      <w:r>
-        <w:rPr>
-          <w:color w:val="ADADAD" w:themeColor="background2" w:themeShade="BF"/>
-          <w:sz w:val="22"/>
-          <w:szCs w:val="22"/>
-        </w:rPr>
-        <w:t>bednets</w:t>
-      </w:r>
-      <w:proofErr w:type="spellEnd"/>
-      <w:r>
-        <w:rPr>
-          <w:color w:val="ADADAD" w:themeColor="background2" w:themeShade="BF"/>
-          <w:sz w:val="22"/>
-          <w:szCs w:val="22"/>
-        </w:rPr>
-        <w:t xml:space="preserve"> – filtering one coverage level </w:t>
+        <w:t xml:space="preserve">simulation with bednets – filtering one coverage level </w:t>
       </w:r>
       <w:r>
         <w:rPr>
@@ -1629,60 +1719,14 @@
           <w:sz w:val="22"/>
           <w:szCs w:val="22"/>
         </w:rPr>
-        <w:t>use same simulation and filter 0-cov as R_</w:t>
-      </w:r>
-      <w:proofErr w:type="gramStart"/>
-      <w:r>
-        <w:rPr>
-          <w:sz w:val="22"/>
-          <w:szCs w:val="22"/>
-        </w:rPr>
-        <w:t>A, and</w:t>
-      </w:r>
-      <w:proofErr w:type="gramEnd"/>
-      <w:r>
-        <w:rPr>
-          <w:sz w:val="22"/>
-          <w:szCs w:val="22"/>
-        </w:rPr>
-        <w:t xml:space="preserve"> split 60% -</w:t>
-      </w:r>
-      <w:proofErr w:type="spellStart"/>
-      <w:r>
-        <w:rPr>
-          <w:sz w:val="22"/>
-          <w:szCs w:val="22"/>
-        </w:rPr>
-        <w:t>cov</w:t>
-      </w:r>
-      <w:proofErr w:type="spellEnd"/>
-      <w:r>
-        <w:rPr>
-          <w:sz w:val="22"/>
-          <w:szCs w:val="22"/>
-        </w:rPr>
-        <w:t xml:space="preserve"> for both LLIN users</w:t>
-      </w:r>
-      <w:r>
-        <w:rPr>
-          <w:sz w:val="22"/>
-          <w:szCs w:val="22"/>
-        </w:rPr>
-        <w:t xml:space="preserve"> (</w:t>
-      </w:r>
-      <w:r>
-        <w:rPr>
-          <w:sz w:val="22"/>
-          <w:szCs w:val="22"/>
-        </w:rPr>
-        <w:t>R_B1</w:t>
-      </w:r>
-      <w:r>
-        <w:rPr>
-          <w:sz w:val="22"/>
-          <w:szCs w:val="22"/>
-        </w:rPr>
-        <w:t>)</w:t>
+        <w:t>use same simulation and filter 0-cov as R_A, and split 60% -cov for both LLIN users</w:t>
+      </w:r>
+      <w:r>
+        <w:rPr>
+          <w:sz w:val="22"/>
+          <w:szCs w:val="22"/>
+        </w:rPr>
+        <w:t xml:space="preserve"> (R_B1)</w:t>
       </w:r>
       <w:r>
         <w:rPr>
@@ -1696,21 +1740,7 @@
           <w:sz w:val="22"/>
           <w:szCs w:val="22"/>
         </w:rPr>
-        <w:t xml:space="preserve"> (</w:t>
-      </w:r>
-      <w:r>
-        <w:rPr>
-          <w:sz w:val="22"/>
-          <w:szCs w:val="22"/>
-        </w:rPr>
-        <w:t>R_B</w:t>
-      </w:r>
-      <w:r>
-        <w:rPr>
-          <w:sz w:val="22"/>
-          <w:szCs w:val="22"/>
-        </w:rPr>
-        <w:t>2)</w:t>
+        <w:t xml:space="preserve"> (R_B2)</w:t>
       </w:r>
       <w:r>
         <w:rPr>
@@ -1884,27 +1914,7 @@
           <w:sz w:val="22"/>
           <w:szCs w:val="22"/>
         </w:rPr>
-        <w:t xml:space="preserve">Higher </w:t>
-      </w:r>
-      <w:proofErr w:type="spellStart"/>
-      <w:r>
-        <w:rPr>
-          <w:b/>
-          <w:bCs/>
-          <w:sz w:val="22"/>
-          <w:szCs w:val="22"/>
-        </w:rPr>
-        <w:t>inocc_infect_ratio</w:t>
-      </w:r>
-      <w:proofErr w:type="spellEnd"/>
-      <w:r>
-        <w:rPr>
-          <w:b/>
-          <w:bCs/>
-          <w:sz w:val="22"/>
-          <w:szCs w:val="22"/>
-        </w:rPr>
-        <w:t xml:space="preserve"> = higher effective immunity</w:t>
+        <w:t>Higher inocc_infect_ratio = higher effective immunity</w:t>
       </w:r>
     </w:p>
     <w:p>
@@ -1980,27 +1990,7 @@
           <w:sz w:val="22"/>
           <w:szCs w:val="22"/>
         </w:rPr>
-        <w:t xml:space="preserve">Lower </w:t>
-      </w:r>
-      <w:proofErr w:type="spellStart"/>
-      <w:r>
-        <w:rPr>
-          <w:b/>
-          <w:bCs/>
-          <w:sz w:val="22"/>
-          <w:szCs w:val="22"/>
-        </w:rPr>
-        <w:t>inocc_infect_ratio</w:t>
-      </w:r>
-      <w:proofErr w:type="spellEnd"/>
-      <w:r>
-        <w:rPr>
-          <w:b/>
-          <w:bCs/>
-          <w:sz w:val="22"/>
-          <w:szCs w:val="22"/>
-        </w:rPr>
-        <w:t xml:space="preserve"> = lower immunity</w:t>
+        <w:t>Lower inocc_infect_ratio = lower immunity</w:t>
       </w:r>
     </w:p>
     <w:p>
@@ -2019,7 +2009,6 @@
           <w:sz w:val="22"/>
           <w:szCs w:val="22"/>
         </w:rPr>
-        <w:lastRenderedPageBreak/>
         <w:t>Each bite more likely to establish infection</w:t>
       </w:r>
     </w:p>
@@ -2051,109 +2040,26 @@
       </w:pPr>
       <w:r>
         <w:rPr>
+          <w:sz w:val="22"/>
+          <w:szCs w:val="22"/>
+        </w:rPr>
+        <w:t>The ratio of inoculations to infection represents the number of infectious bites required to generate one blood-stage infection, and therefore serves as a proxy for host-level resistance to infection driven by acquired immunity</w:t>
+      </w:r>
+      <w:r>
+        <w:rPr>
           <w:noProof/>
-          <w:sz w:val="22"/>
-          <w:szCs w:val="22"/>
-        </w:rPr>
-        <mc:AlternateContent>
-          <mc:Choice Requires="wps">
-            <w:drawing>
-              <wp:anchor distT="0" distB="0" distL="114300" distR="114300" simplePos="0" relativeHeight="251659264" behindDoc="0" locked="0" layoutInCell="1" allowOverlap="1" wp14:anchorId="55BA134E" wp14:editId="4B864D34">
-                <wp:simplePos x="0" y="0"/>
-                <wp:positionH relativeFrom="column">
-                  <wp:posOffset>225706</wp:posOffset>
-                </wp:positionH>
-                <wp:positionV relativeFrom="paragraph">
-                  <wp:posOffset>3782848</wp:posOffset>
-                </wp:positionV>
-                <wp:extent cx="2760562" cy="540000"/>
-                <wp:effectExtent l="0" t="0" r="20955" b="12700"/>
-                <wp:wrapNone/>
-                <wp:docPr id="719424574" name="Rectangle: Rounded Corners 1"/>
-                <wp:cNvGraphicFramePr/>
-                <a:graphic xmlns:a="http://schemas.openxmlformats.org/drawingml/2006/main">
-                  <a:graphicData uri="http://schemas.microsoft.com/office/word/2010/wordprocessingShape">
-                    <wps:wsp>
-                      <wps:cNvSpPr/>
-                      <wps:spPr>
-                        <a:xfrm>
-                          <a:off x="0" y="0"/>
-                          <a:ext cx="2760562" cy="540000"/>
-                        </a:xfrm>
-                        <a:prstGeom prst="roundRect">
-                          <a:avLst/>
-                        </a:prstGeom>
-                        <a:noFill/>
-                        <a:ln>
-                          <a:solidFill>
-                            <a:srgbClr val="FFC000"/>
-                          </a:solidFill>
-                        </a:ln>
-                      </wps:spPr>
-                      <wps:style>
-                        <a:lnRef idx="2">
-                          <a:schemeClr val="accent1">
-                            <a:shade val="15000"/>
-                          </a:schemeClr>
-                        </a:lnRef>
-                        <a:fillRef idx="1">
-                          <a:schemeClr val="accent1"/>
-                        </a:fillRef>
-                        <a:effectRef idx="0">
-                          <a:schemeClr val="accent1"/>
-                        </a:effectRef>
-                        <a:fontRef idx="minor">
-                          <a:schemeClr val="lt1"/>
-                        </a:fontRef>
-                      </wps:style>
-                      <wps:bodyPr rot="0" spcFirstLastPara="0" vertOverflow="overflow" horzOverflow="overflow" vert="horz" wrap="square" lIns="91440" tIns="45720" rIns="91440" bIns="45720" numCol="1" spcCol="0" rtlCol="0" fromWordArt="0" anchor="ctr" anchorCtr="0" forceAA="0" compatLnSpc="1">
-                        <a:prstTxWarp prst="textNoShape">
-                          <a:avLst/>
-                        </a:prstTxWarp>
-                        <a:noAutofit/>
-                      </wps:bodyPr>
-                    </wps:wsp>
-                  </a:graphicData>
-                </a:graphic>
-                <wp14:sizeRelH relativeFrom="margin">
-                  <wp14:pctWidth>0</wp14:pctWidth>
-                </wp14:sizeRelH>
-                <wp14:sizeRelV relativeFrom="margin">
-                  <wp14:pctHeight>0</wp14:pctHeight>
-                </wp14:sizeRelV>
-              </wp:anchor>
-            </w:drawing>
-          </mc:Choice>
-          <mc:Fallback>
-            <w:pict>
-              <v:roundrect w14:anchorId="52D8C182" id="Rectangle: Rounded Corners 1" o:spid="_x0000_s1026" style="position:absolute;margin-left:17.75pt;margin-top:297.85pt;width:217.35pt;height:42.5pt;z-index:251659264;visibility:visible;mso-wrap-style:square;mso-width-percent:0;mso-height-percent:0;mso-wrap-distance-left:9pt;mso-wrap-distance-top:0;mso-wrap-distance-right:9pt;mso-wrap-distance-bottom:0;mso-position-horizontal:absolute;mso-position-horizontal-relative:text;mso-position-vertical:absolute;mso-position-vertical-relative:text;mso-width-percent:0;mso-height-percent:0;mso-width-relative:margin;mso-height-relative:margin;v-text-anchor:middle" arcsize="10923f" o:gfxdata="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" filled="f" strokecolor="#ffc000" strokeweight="1.5pt">
-                <v:stroke joinstyle="miter"/>
-              </v:roundrect>
-            </w:pict>
-          </mc:Fallback>
-        </mc:AlternateContent>
-      </w:r>
-      <w:r>
-        <w:rPr>
-          <w:sz w:val="22"/>
-          <w:szCs w:val="22"/>
-        </w:rPr>
-        <w:t>The ratio of inoculations to infection represents the number of infectious bites required to generate one blood-stage infection, and therefore serves as a proxy for host-level resistance to infection driven by acquired immunity</w:t>
+        </w:rPr>
+        <w:t xml:space="preserve"> </w:t>
       </w:r>
       <w:r>
         <w:rPr>
           <w:noProof/>
         </w:rPr>
-        <w:t xml:space="preserve"> </w:t>
-      </w:r>
-      <w:r>
-        <w:rPr>
-          <w:noProof/>
-        </w:rPr>
+        <w:lastRenderedPageBreak/>
         <w:drawing>
-          <wp:inline distT="0" distB="0" distL="0" distR="0" wp14:anchorId="5D099117" wp14:editId="703A0C5F">
-            <wp:extent cx="5731510" cy="4019550"/>
-            <wp:effectExtent l="0" t="0" r="2540" b="0"/>
+          <wp:inline distT="0" distB="0" distL="0" distR="0" wp14:anchorId="5D099117" wp14:editId="55F0145A">
+            <wp:extent cx="4554638" cy="3194201"/>
+            <wp:effectExtent l="0" t="0" r="0" b="6350"/>
             <wp:docPr id="1157613463" name="Picture 1" descr="A graph of a number of people with infection&#10;&#10;AI-generated content may be incorrect."/>
             <wp:cNvGraphicFramePr>
               <a:graphicFrameLocks xmlns:a="http://schemas.openxmlformats.org/drawingml/2006/main" noChangeAspect="1"/>
@@ -2166,7 +2072,7 @@
                     <pic:cNvPicPr/>
                   </pic:nvPicPr>
                   <pic:blipFill>
-                    <a:blip r:embed="rId13"/>
+                    <a:blip r:embed="rId16"/>
                     <a:stretch>
                       <a:fillRect/>
                     </a:stretch>
@@ -2174,7 +2080,7 @@
                   <pic:spPr>
                     <a:xfrm>
                       <a:off x="0" y="0"/>
-                      <a:ext cx="5731510" cy="4019550"/>
+                      <a:ext cx="4561979" cy="3199349"/>
                     </a:xfrm>
                     <a:prstGeom prst="rect">
                       <a:avLst/>
@@ -2217,33 +2123,22 @@
     </w:p>
     <w:p>
       <w:pPr>
-        <w:rPr>
-          <w:sz w:val="22"/>
-          <w:szCs w:val="22"/>
-        </w:rPr>
-      </w:pPr>
-      <w:r>
-        <w:rPr>
-          <w:sz w:val="22"/>
-          <w:szCs w:val="22"/>
-        </w:rPr>
-        <w:t>trade-off between acquired immunity and intervention coverage maybe: contour plot for non-</w:t>
-      </w:r>
-      <w:proofErr w:type="gramStart"/>
-      <w:r>
-        <w:rPr>
-          <w:sz w:val="22"/>
-          <w:szCs w:val="22"/>
-        </w:rPr>
-        <w:t>users</w:t>
-      </w:r>
-      <w:proofErr w:type="gramEnd"/>
-      <w:r>
-        <w:rPr>
-          <w:sz w:val="22"/>
-          <w:szCs w:val="22"/>
-        </w:rPr>
-        <w:t xml:space="preserve"> cohort</w:t>
+        <w:pStyle w:val="ListParagraph"/>
+        <w:numPr>
+          <w:ilvl w:val="0"/>
+          <w:numId w:val="9"/>
+        </w:numPr>
+        <w:rPr>
+          <w:sz w:val="22"/>
+          <w:szCs w:val="22"/>
+        </w:rPr>
+      </w:pPr>
+      <w:r>
+        <w:rPr>
+          <w:sz w:val="22"/>
+          <w:szCs w:val="22"/>
+        </w:rPr>
+        <w:t>trade-off between acquired immunity and intervention coverage maybe: contour plot for non-users cohort</w:t>
       </w:r>
       <w:r>
         <w:rPr>
@@ -2251,55 +2146,7 @@
           <w:szCs w:val="22"/>
         </w:rPr>
         <w:br/>
-        <w:t xml:space="preserve">x-axis coverage of </w:t>
-      </w:r>
-      <w:proofErr w:type="spellStart"/>
-      <w:r>
-        <w:rPr>
-          <w:sz w:val="22"/>
-          <w:szCs w:val="22"/>
-        </w:rPr>
-        <w:t>itn</w:t>
-      </w:r>
-      <w:proofErr w:type="spellEnd"/>
-      <w:r>
-        <w:rPr>
-          <w:sz w:val="22"/>
-          <w:szCs w:val="22"/>
-        </w:rPr>
-        <w:t xml:space="preserve"> (20,40,60,80</w:t>
-      </w:r>
-      <w:proofErr w:type="gramStart"/>
-      <w:r>
-        <w:rPr>
-          <w:sz w:val="22"/>
-          <w:szCs w:val="22"/>
-        </w:rPr>
-        <w:t>%)  [</w:t>
-      </w:r>
-      <w:proofErr w:type="gramEnd"/>
-      <w:r>
-        <w:rPr>
-          <w:sz w:val="22"/>
-          <w:szCs w:val="22"/>
-        </w:rPr>
-        <w:t xml:space="preserve">effective coverage with </w:t>
-      </w:r>
-      <w:proofErr w:type="spellStart"/>
-      <w:r>
-        <w:rPr>
-          <w:sz w:val="22"/>
-          <w:szCs w:val="22"/>
-        </w:rPr>
-        <w:t>ITNs</w:t>
-      </w:r>
-      <w:proofErr w:type="spellEnd"/>
-      <w:r>
-        <w:rPr>
-          <w:sz w:val="22"/>
-          <w:szCs w:val="22"/>
-        </w:rPr>
-        <w:t>]</w:t>
+        <w:t>x-axis coverage of itn (20,40,60,80%)  [effective coverage with ITNs]</w:t>
       </w:r>
       <w:r>
         <w:rPr>
@@ -2307,23 +2154,7 @@
           <w:szCs w:val="22"/>
         </w:rPr>
         <w:br/>
-        <w:t xml:space="preserve">y-axis </w:t>
-      </w:r>
-      <w:proofErr w:type="spellStart"/>
-      <w:r>
-        <w:rPr>
-          <w:sz w:val="22"/>
-          <w:szCs w:val="22"/>
-        </w:rPr>
-        <w:t>inocc_infect_ratio</w:t>
-      </w:r>
-      <w:proofErr w:type="spellEnd"/>
-      <w:r>
-        <w:rPr>
-          <w:sz w:val="22"/>
-          <w:szCs w:val="22"/>
-        </w:rPr>
-        <w:t xml:space="preserve"> [acquired immunity]</w:t>
+        <w:t>y-axis inocc_infect_ratio [acquired immunity]</w:t>
       </w:r>
       <w:r>
         <w:rPr>
@@ -2332,6 +2163,57 @@
         </w:rPr>
         <w:br/>
         <w:t>z axis prevalence reduction [epi outcome]</w:t>
+      </w:r>
+    </w:p>
+    <w:p>
+      <w:pPr>
+        <w:pStyle w:val="ListParagraph"/>
+        <w:rPr>
+          <w:sz w:val="22"/>
+          <w:szCs w:val="22"/>
+        </w:rPr>
+      </w:pPr>
+      <w:r>
+        <w:rPr>
+          <w:noProof/>
+          <w:sz w:val="22"/>
+          <w:szCs w:val="22"/>
+        </w:rPr>
+        <w:drawing>
+          <wp:inline distT="0" distB="0" distL="0" distR="0" wp14:anchorId="4C68DBDC" wp14:editId="7925C79C">
+            <wp:extent cx="4444678" cy="2725603"/>
+            <wp:effectExtent l="0" t="0" r="0" b="0"/>
+            <wp:docPr id="1992577026" name="Picture 1"/>
+            <wp:cNvGraphicFramePr>
+              <a:graphicFrameLocks xmlns:a="http://schemas.openxmlformats.org/drawingml/2006/main" noChangeAspect="1"/>
+            </wp:cNvGraphicFramePr>
+            <a:graphic xmlns:a="http://schemas.openxmlformats.org/drawingml/2006/main">
+              <a:graphicData uri="http://schemas.openxmlformats.org/drawingml/2006/picture">
+                <pic:pic xmlns:pic="http://schemas.openxmlformats.org/drawingml/2006/picture">
+                  <pic:nvPicPr>
+                    <pic:cNvPr id="1992577026" name=""/>
+                    <pic:cNvPicPr/>
+                  </pic:nvPicPr>
+                  <pic:blipFill>
+                    <a:blip r:embed="rId17"/>
+                    <a:stretch>
+                      <a:fillRect/>
+                    </a:stretch>
+                  </pic:blipFill>
+                  <pic:spPr>
+                    <a:xfrm>
+                      <a:off x="0" y="0"/>
+                      <a:ext cx="4452888" cy="2730637"/>
+                    </a:xfrm>
+                    <a:prstGeom prst="rect">
+                      <a:avLst/>
+                    </a:prstGeom>
+                  </pic:spPr>
+                </pic:pic>
+              </a:graphicData>
+            </a:graphic>
+          </wp:inline>
+        </w:drawing>
       </w:r>
     </w:p>
     <w:p>
@@ -2351,45 +2233,164 @@
           <w:sz w:val="22"/>
           <w:szCs w:val="22"/>
         </w:rPr>
-        <w:t xml:space="preserve">new </w:t>
-      </w:r>
-      <w:proofErr w:type="spellStart"/>
-      <w:r>
-        <w:rPr>
-          <w:sz w:val="22"/>
-          <w:szCs w:val="22"/>
-        </w:rPr>
-        <w:t>bednet</w:t>
-      </w:r>
-      <w:proofErr w:type="spellEnd"/>
-      <w:r>
-        <w:rPr>
-          <w:sz w:val="22"/>
-          <w:szCs w:val="22"/>
-        </w:rPr>
-        <w:t xml:space="preserve"> parameterization</w:t>
-      </w:r>
-    </w:p>
-    <w:p>
-      <w:pPr>
-        <w:rPr>
-          <w:sz w:val="22"/>
-          <w:szCs w:val="22"/>
-        </w:rPr>
-      </w:pPr>
-      <w:r>
-        <w:rPr>
-          <w:sz w:val="22"/>
-          <w:szCs w:val="22"/>
-        </w:rPr>
-        <w:t>How much community protection is needed to compensate for reduced immunity</w:t>
-      </w:r>
-      <w:r>
-        <w:rPr>
-          <w:sz w:val="22"/>
-          <w:szCs w:val="22"/>
-        </w:rPr>
-        <w:t xml:space="preserve"> among non-users?</w:t>
+        <w:t>new bednet parameterization</w:t>
+      </w:r>
+    </w:p>
+    <w:p>
+      <w:pPr>
+        <w:ind w:left="360"/>
+        <w:rPr>
+          <w:sz w:val="22"/>
+          <w:szCs w:val="22"/>
+        </w:rPr>
+      </w:pPr>
+      <w:r>
+        <w:rPr>
+          <w:sz w:val="22"/>
+          <w:szCs w:val="22"/>
+        </w:rPr>
+        <w:t>AUTHORSHIP RULES</w:t>
+      </w:r>
+    </w:p>
+    <w:p>
+      <w:pPr>
+        <w:pStyle w:val="ListParagraph"/>
+        <w:numPr>
+          <w:ilvl w:val="0"/>
+          <w:numId w:val="10"/>
+        </w:numPr>
+        <w:rPr>
+          <w:sz w:val="22"/>
+          <w:szCs w:val="22"/>
+        </w:rPr>
+      </w:pPr>
+      <w:r>
+        <w:rPr>
+          <w:sz w:val="22"/>
+          <w:szCs w:val="22"/>
+        </w:rPr>
+        <w:t>ICMJE</w:t>
+      </w:r>
+    </w:p>
+    <w:p>
+      <w:pPr>
+        <w:pStyle w:val="ListParagraph"/>
+        <w:numPr>
+          <w:ilvl w:val="0"/>
+          <w:numId w:val="10"/>
+        </w:numPr>
+        <w:rPr>
+          <w:sz w:val="22"/>
+          <w:szCs w:val="22"/>
+        </w:rPr>
+      </w:pPr>
+      <w:r>
+        <w:rPr>
+          <w:sz w:val="22"/>
+          <w:szCs w:val="22"/>
+        </w:rPr>
+        <w:t>biomedical world</w:t>
+      </w:r>
+    </w:p>
+    <w:p>
+      <w:pPr>
+        <w:pStyle w:val="ListParagraph"/>
+        <w:numPr>
+          <w:ilvl w:val="0"/>
+          <w:numId w:val="10"/>
+        </w:numPr>
+        <w:rPr>
+          <w:sz w:val="22"/>
+          <w:szCs w:val="22"/>
+        </w:rPr>
+      </w:pPr>
+      <w:r>
+        <w:rPr>
+          <w:sz w:val="22"/>
+          <w:szCs w:val="22"/>
+        </w:rPr>
+        <w:t>contributorship policy</w:t>
+      </w:r>
+    </w:p>
+    <w:p>
+      <w:pPr>
+        <w:pStyle w:val="ListParagraph"/>
+        <w:numPr>
+          <w:ilvl w:val="0"/>
+          <w:numId w:val="10"/>
+        </w:numPr>
+        <w:rPr>
+          <w:sz w:val="22"/>
+          <w:szCs w:val="22"/>
+        </w:rPr>
+      </w:pPr>
+      <w:r>
+        <w:rPr>
+          <w:sz w:val="22"/>
+          <w:szCs w:val="22"/>
+        </w:rPr>
+        <w:lastRenderedPageBreak/>
+        <w:t>substantial contributions</w:t>
+      </w:r>
+    </w:p>
+    <w:p>
+      <w:pPr>
+        <w:pStyle w:val="ListParagraph"/>
+        <w:numPr>
+          <w:ilvl w:val="0"/>
+          <w:numId w:val="10"/>
+        </w:numPr>
+        <w:rPr>
+          <w:sz w:val="22"/>
+          <w:szCs w:val="22"/>
+        </w:rPr>
+      </w:pPr>
+      <w:r>
+        <w:rPr>
+          <w:sz w:val="22"/>
+          <w:szCs w:val="22"/>
+        </w:rPr>
+        <w:t>drafting and revising</w:t>
+      </w:r>
+    </w:p>
+    <w:p>
+      <w:pPr>
+        <w:pStyle w:val="ListParagraph"/>
+        <w:numPr>
+          <w:ilvl w:val="0"/>
+          <w:numId w:val="10"/>
+        </w:numPr>
+        <w:rPr>
+          <w:sz w:val="22"/>
+          <w:szCs w:val="22"/>
+        </w:rPr>
+      </w:pPr>
+      <w:r>
+        <w:rPr>
+          <w:sz w:val="22"/>
+          <w:szCs w:val="22"/>
+        </w:rPr>
+        <w:t>final approval</w:t>
+      </w:r>
+    </w:p>
+    <w:p>
+      <w:pPr>
+        <w:pStyle w:val="ListParagraph"/>
+        <w:numPr>
+          <w:ilvl w:val="0"/>
+          <w:numId w:val="10"/>
+        </w:numPr>
+        <w:rPr>
+          <w:sz w:val="22"/>
+          <w:szCs w:val="22"/>
+        </w:rPr>
+      </w:pPr>
+      <w:r>
+        <w:rPr>
+          <w:sz w:val="22"/>
+          <w:szCs w:val="22"/>
+        </w:rPr>
+        <w:t>Bohannomn, sceience (4 october 2013) – who is afraid of peer review?</w:t>
       </w:r>
     </w:p>
     <w:sectPr>
@@ -3164,6 +3165,231 @@
     </w:lvl>
   </w:abstractNum>
   <w:abstractNum w:abstractNumId="5" w15:restartNumberingAfterBreak="0">
+    <w:nsid w:val="507606D3"/>
+    <w:multiLevelType w:val="hybridMultilevel"/>
+    <w:tmpl w:val="E230F2B4"/>
+    <w:lvl w:ilvl="0" w:tplc="95A8DFD8">
+      <w:numFmt w:val="bullet"/>
+      <w:lvlText w:val="-"/>
+      <w:lvlJc w:val="left"/>
+      <w:pPr>
+        <w:ind w:left="720" w:hanging="360"/>
+      </w:pPr>
+      <w:rPr>
+        <w:rFonts w:ascii="Aptos" w:eastAsiaTheme="minorHAnsi" w:hAnsi="Aptos" w:cstheme="minorBidi" w:hint="default"/>
+      </w:rPr>
+    </w:lvl>
+    <w:lvl w:ilvl="1" w:tplc="0C000003" w:tentative="1">
+      <w:start w:val="1"/>
+      <w:numFmt w:val="bullet"/>
+      <w:lvlText w:val="o"/>
+      <w:lvlJc w:val="left"/>
+      <w:pPr>
+        <w:ind w:left="1440" w:hanging="360"/>
+      </w:pPr>
+      <w:rPr>
+        <w:rFonts w:ascii="Courier New" w:hAnsi="Courier New" w:cs="Courier New" w:hint="default"/>
+      </w:rPr>
+    </w:lvl>
+    <w:lvl w:ilvl="2" w:tplc="0C000005" w:tentative="1">
+      <w:start w:val="1"/>
+      <w:numFmt w:val="bullet"/>
+      <w:lvlText w:val=""/>
+      <w:lvlJc w:val="left"/>
+      <w:pPr>
+        <w:ind w:left="2160" w:hanging="360"/>
+      </w:pPr>
+      <w:rPr>
+        <w:rFonts w:ascii="Wingdings" w:hAnsi="Wingdings" w:hint="default"/>
+      </w:rPr>
+    </w:lvl>
+    <w:lvl w:ilvl="3" w:tplc="0C000001" w:tentative="1">
+      <w:start w:val="1"/>
+      <w:numFmt w:val="bullet"/>
+      <w:lvlText w:val=""/>
+      <w:lvlJc w:val="left"/>
+      <w:pPr>
+        <w:ind w:left="2880" w:hanging="360"/>
+      </w:pPr>
+      <w:rPr>
+        <w:rFonts w:ascii="Symbol" w:hAnsi="Symbol" w:hint="default"/>
+      </w:rPr>
+    </w:lvl>
+    <w:lvl w:ilvl="4" w:tplc="0C000003" w:tentative="1">
+      <w:start w:val="1"/>
+      <w:numFmt w:val="bullet"/>
+      <w:lvlText w:val="o"/>
+      <w:lvlJc w:val="left"/>
+      <w:pPr>
+        <w:ind w:left="3600" w:hanging="360"/>
+      </w:pPr>
+      <w:rPr>
+        <w:rFonts w:ascii="Courier New" w:hAnsi="Courier New" w:cs="Courier New" w:hint="default"/>
+      </w:rPr>
+    </w:lvl>
+    <w:lvl w:ilvl="5" w:tplc="0C000005" w:tentative="1">
+      <w:start w:val="1"/>
+      <w:numFmt w:val="bullet"/>
+      <w:lvlText w:val=""/>
+      <w:lvlJc w:val="left"/>
+      <w:pPr>
+        <w:ind w:left="4320" w:hanging="360"/>
+      </w:pPr>
+      <w:rPr>
+        <w:rFonts w:ascii="Wingdings" w:hAnsi="Wingdings" w:hint="default"/>
+      </w:rPr>
+    </w:lvl>
+    <w:lvl w:ilvl="6" w:tplc="0C000001" w:tentative="1">
+      <w:start w:val="1"/>
+      <w:numFmt w:val="bullet"/>
+      <w:lvlText w:val=""/>
+      <w:lvlJc w:val="left"/>
+      <w:pPr>
+        <w:ind w:left="5040" w:hanging="360"/>
+      </w:pPr>
+      <w:rPr>
+        <w:rFonts w:ascii="Symbol" w:hAnsi="Symbol" w:hint="default"/>
+      </w:rPr>
+    </w:lvl>
+    <w:lvl w:ilvl="7" w:tplc="0C000003" w:tentative="1">
+      <w:start w:val="1"/>
+      <w:numFmt w:val="bullet"/>
+      <w:lvlText w:val="o"/>
+      <w:lvlJc w:val="left"/>
+      <w:pPr>
+        <w:ind w:left="5760" w:hanging="360"/>
+      </w:pPr>
+      <w:rPr>
+        <w:rFonts w:ascii="Courier New" w:hAnsi="Courier New" w:cs="Courier New" w:hint="default"/>
+      </w:rPr>
+    </w:lvl>
+    <w:lvl w:ilvl="8" w:tplc="0C000005" w:tentative="1">
+      <w:start w:val="1"/>
+      <w:numFmt w:val="bullet"/>
+      <w:lvlText w:val=""/>
+      <w:lvlJc w:val="left"/>
+      <w:pPr>
+        <w:ind w:left="6480" w:hanging="360"/>
+      </w:pPr>
+      <w:rPr>
+        <w:rFonts w:ascii="Wingdings" w:hAnsi="Wingdings" w:hint="default"/>
+      </w:rPr>
+    </w:lvl>
+  </w:abstractNum>
+  <w:abstractNum w:abstractNumId="6" w15:restartNumberingAfterBreak="0">
+    <w:nsid w:val="77E55436"/>
+    <w:multiLevelType w:val="hybridMultilevel"/>
+    <w:tmpl w:val="D1E6FFC4"/>
+    <w:lvl w:ilvl="0" w:tplc="0C000001">
+      <w:start w:val="1"/>
+      <w:numFmt w:val="bullet"/>
+      <w:lvlText w:val=""/>
+      <w:lvlJc w:val="left"/>
+      <w:pPr>
+        <w:ind w:left="720" w:hanging="360"/>
+      </w:pPr>
+      <w:rPr>
+        <w:rFonts w:ascii="Symbol" w:hAnsi="Symbol" w:hint="default"/>
+      </w:rPr>
+    </w:lvl>
+    <w:lvl w:ilvl="1" w:tplc="0C000003" w:tentative="1">
+      <w:start w:val="1"/>
+      <w:numFmt w:val="bullet"/>
+      <w:lvlText w:val="o"/>
+      <w:lvlJc w:val="left"/>
+      <w:pPr>
+        <w:ind w:left="1440" w:hanging="360"/>
+      </w:pPr>
+      <w:rPr>
+        <w:rFonts w:ascii="Courier New" w:hAnsi="Courier New" w:cs="Courier New" w:hint="default"/>
+      </w:rPr>
+    </w:lvl>
+    <w:lvl w:ilvl="2" w:tplc="0C000005" w:tentative="1">
+      <w:start w:val="1"/>
+      <w:numFmt w:val="bullet"/>
+      <w:lvlText w:val=""/>
+      <w:lvlJc w:val="left"/>
+      <w:pPr>
+        <w:ind w:left="2160" w:hanging="360"/>
+      </w:pPr>
+      <w:rPr>
+        <w:rFonts w:ascii="Wingdings" w:hAnsi="Wingdings" w:hint="default"/>
+      </w:rPr>
+    </w:lvl>
+    <w:lvl w:ilvl="3" w:tplc="0C000001" w:tentative="1">
+      <w:start w:val="1"/>
+      <w:numFmt w:val="bullet"/>
+      <w:lvlText w:val=""/>
+      <w:lvlJc w:val="left"/>
+      <w:pPr>
+        <w:ind w:left="2880" w:hanging="360"/>
+      </w:pPr>
+      <w:rPr>
+        <w:rFonts w:ascii="Symbol" w:hAnsi="Symbol" w:hint="default"/>
+      </w:rPr>
+    </w:lvl>
+    <w:lvl w:ilvl="4" w:tplc="0C000003" w:tentative="1">
+      <w:start w:val="1"/>
+      <w:numFmt w:val="bullet"/>
+      <w:lvlText w:val="o"/>
+      <w:lvlJc w:val="left"/>
+      <w:pPr>
+        <w:ind w:left="3600" w:hanging="360"/>
+      </w:pPr>
+      <w:rPr>
+        <w:rFonts w:ascii="Courier New" w:hAnsi="Courier New" w:cs="Courier New" w:hint="default"/>
+      </w:rPr>
+    </w:lvl>
+    <w:lvl w:ilvl="5" w:tplc="0C000005" w:tentative="1">
+      <w:start w:val="1"/>
+      <w:numFmt w:val="bullet"/>
+      <w:lvlText w:val=""/>
+      <w:lvlJc w:val="left"/>
+      <w:pPr>
+        <w:ind w:left="4320" w:hanging="360"/>
+      </w:pPr>
+      <w:rPr>
+        <w:rFonts w:ascii="Wingdings" w:hAnsi="Wingdings" w:hint="default"/>
+      </w:rPr>
+    </w:lvl>
+    <w:lvl w:ilvl="6" w:tplc="0C000001" w:tentative="1">
+      <w:start w:val="1"/>
+      <w:numFmt w:val="bullet"/>
+      <w:lvlText w:val=""/>
+      <w:lvlJc w:val="left"/>
+      <w:pPr>
+        <w:ind w:left="5040" w:hanging="360"/>
+      </w:pPr>
+      <w:rPr>
+        <w:rFonts w:ascii="Symbol" w:hAnsi="Symbol" w:hint="default"/>
+      </w:rPr>
+    </w:lvl>
+    <w:lvl w:ilvl="7" w:tplc="0C000003" w:tentative="1">
+      <w:start w:val="1"/>
+      <w:numFmt w:val="bullet"/>
+      <w:lvlText w:val="o"/>
+      <w:lvlJc w:val="left"/>
+      <w:pPr>
+        <w:ind w:left="5760" w:hanging="360"/>
+      </w:pPr>
+      <w:rPr>
+        <w:rFonts w:ascii="Courier New" w:hAnsi="Courier New" w:cs="Courier New" w:hint="default"/>
+      </w:rPr>
+    </w:lvl>
+    <w:lvl w:ilvl="8" w:tplc="0C000005" w:tentative="1">
+      <w:start w:val="1"/>
+      <w:numFmt w:val="bullet"/>
+      <w:lvlText w:val=""/>
+      <w:lvlJc w:val="left"/>
+      <w:pPr>
+        <w:ind w:left="6480" w:hanging="360"/>
+      </w:pPr>
+      <w:rPr>
+        <w:rFonts w:ascii="Wingdings" w:hAnsi="Wingdings" w:hint="default"/>
+      </w:rPr>
+    </w:lvl>
+  </w:abstractNum>
+  <w:abstractNum w:abstractNumId="7" w15:restartNumberingAfterBreak="0">
     <w:nsid w:val="795B691C"/>
     <w:multiLevelType w:val="multilevel"/>
     <w:tmpl w:val="307EA422"/>
@@ -3312,7 +3538,7 @@
       </w:rPr>
     </w:lvl>
   </w:abstractNum>
-  <w:abstractNum w:abstractNumId="6" w15:restartNumberingAfterBreak="0">
+  <w:abstractNum w:abstractNumId="8" w15:restartNumberingAfterBreak="0">
     <w:nsid w:val="7CCA25A0"/>
     <w:multiLevelType w:val="hybridMultilevel"/>
     <w:tmpl w:val="F404E1F8"/>
@@ -3401,7 +3627,7 @@
       </w:pPr>
     </w:lvl>
   </w:abstractNum>
-  <w:abstractNum w:abstractNumId="7" w15:restartNumberingAfterBreak="0">
+  <w:abstractNum w:abstractNumId="9" w15:restartNumberingAfterBreak="0">
     <w:nsid w:val="7EE27B97"/>
     <w:multiLevelType w:val="hybridMultilevel"/>
     <w:tmpl w:val="6C4AE92A"/>
@@ -3521,22 +3747,28 @@
     <w:abstractNumId w:val="2"/>
   </w:num>
   <w:num w:numId="3" w16cid:durableId="1918246229">
-    <w:abstractNumId w:val="7"/>
+    <w:abstractNumId w:val="9"/>
   </w:num>
   <w:num w:numId="4" w16cid:durableId="119341886">
-    <w:abstractNumId w:val="6"/>
+    <w:abstractNumId w:val="8"/>
   </w:num>
   <w:num w:numId="5" w16cid:durableId="995036704">
     <w:abstractNumId w:val="0"/>
   </w:num>
   <w:num w:numId="6" w16cid:durableId="806704756">
-    <w:abstractNumId w:val="5"/>
+    <w:abstractNumId w:val="7"/>
   </w:num>
   <w:num w:numId="7" w16cid:durableId="1015577522">
     <w:abstractNumId w:val="1"/>
   </w:num>
   <w:num w:numId="8" w16cid:durableId="351496300">
     <w:abstractNumId w:val="3"/>
+  </w:num>
+  <w:num w:numId="9" w16cid:durableId="1759398903">
+    <w:abstractNumId w:val="6"/>
+  </w:num>
+  <w:num w:numId="10" w16cid:durableId="1546215115">
+    <w:abstractNumId w:val="5"/>
   </w:num>
 </w:numbering>
 </file>

</xml_diff>